<commit_message>
Repair portfolio pages, public project evidence, mobile navigation, and resume education
</commit_message>
<xml_diff>
--- a/Zamor, Yves-Claude resume update.docx
+++ b/Zamor, Yves-Claude resume update.docx
@@ -82,7 +82,7 @@
     </w:p>
     <w:p>
       <w:pPr>
-        <w:spacing w:after="0" w:line="240" w:lineRule="auto"/>
+        <w:spacing w:after="0" w:line="40" w:lineRule="exact" w:before="0"/>
         <w:contextualSpacing/>
       </w:pPr>
     </w:p>
@@ -121,7 +121,7 @@
     </w:p>
     <w:p>
       <w:pPr>
-        <w:spacing w:after="0" w:line="240" w:lineRule="auto"/>
+        <w:spacing w:after="0" w:line="40" w:lineRule="exact" w:before="0"/>
         <w:contextualSpacing/>
       </w:pPr>
     </w:p>
@@ -164,7 +164,7 @@
           <w:sz w:val="20"/>
           <w:szCs w:val="20"/>
         </w:rPr>
-        <w:t>Skilled in cybersecurity practices, network security, and risk management with a focus on ethical hacking and threat mitigation, supported by relevant coursework in infrastructure security and cloud computing through Undergraduate Certificate program in Cyber Security</w:t>
+        <w:t>Skilled in cybersecurity practices, network security, and risk management with a focus on ethical hacking and threat mitigation, supported by a Bachelor of Science in Cybersecurity and Networking from DeVry University, earned Summa Cum Laude in 2026</w:t>
       </w:r>
     </w:p>
     <w:p>
@@ -238,7 +238,7 @@
     </w:p>
     <w:p>
       <w:pPr>
-        <w:spacing w:after="0" w:line="240" w:lineRule="auto"/>
+        <w:spacing w:after="0" w:line="40" w:lineRule="exact" w:before="0"/>
         <w:contextualSpacing/>
       </w:pPr>
     </w:p>
@@ -339,7 +339,7 @@
     </w:p>
     <w:p>
       <w:pPr>
-        <w:spacing w:after="0" w:line="240" w:lineRule="auto"/>
+        <w:spacing w:after="0" w:line="40" w:lineRule="exact" w:before="0"/>
         <w:contextualSpacing/>
       </w:pPr>
     </w:p>
@@ -360,6 +360,46 @@
           <w:bCs/>
         </w:rPr>
         <w:t>Education</w:t>
+      </w:r>
+    </w:p>
+    <w:p>
+      <w:pPr>
+        <w:spacing w:after="0" w:line="240" w:lineRule="auto"/>
+        <w:contextualSpacing/>
+        <w:rPr>
+          <w:b/>
+          <w:bCs/>
+          <w:sz w:val="20"/>
+          <w:szCs w:val="20"/>
+        </w:rPr>
+      </w:pPr>
+      <w:r>
+        <w:rPr>
+          <w:b/>
+          <w:bCs/>
+          <w:sz w:val="20"/>
+          <w:szCs w:val="20"/>
+        </w:rPr>
+        <w:t>Bachelor of Science in Cybersecurity and Networking</w:t>
+      </w:r>
+    </w:p>
+    <w:p>
+      <w:pPr>
+        <w:spacing w:after="0" w:line="240" w:lineRule="auto"/>
+        <w:contextualSpacing/>
+        <w:rPr>
+          <w:sz w:val="20"/>
+          <w:szCs w:val="20"/>
+        </w:rPr>
+      </w:pPr>
+      <w:r>
+        <w:rPr>
+          <w:i/>
+          <w:iCs/>
+          <w:sz w:val="20"/>
+          <w:szCs w:val="20"/>
+        </w:rPr>
+        <w:t>DeVry University | August 2026 | Summa Cum Laude</w:t>
       </w:r>
     </w:p>
     <w:p>
@@ -471,7 +511,7 @@
     </w:p>
     <w:p>
       <w:pPr>
-        <w:spacing w:after="0" w:line="240" w:lineRule="auto"/>
+        <w:spacing w:after="0" w:line="40" w:lineRule="exact" w:before="0"/>
         <w:contextualSpacing/>
         <w:rPr>
           <w:b/>
@@ -577,7 +617,7 @@
     </w:p>
     <w:p>
       <w:pPr>
-        <w:spacing w:after="0" w:line="240" w:lineRule="auto"/>
+        <w:spacing w:after="0" w:line="40" w:lineRule="exact" w:before="0"/>
         <w:contextualSpacing/>
       </w:pPr>
     </w:p>
@@ -679,7 +719,7 @@
     </w:p>
     <w:p>
       <w:pPr>
-        <w:spacing w:after="0" w:line="240" w:lineRule="auto"/>
+        <w:spacing w:after="0" w:line="40" w:lineRule="exact" w:before="0"/>
         <w:contextualSpacing/>
         <w:rPr>
           <w:b/>
@@ -768,7 +808,7 @@
     </w:p>
     <w:p>
       <w:pPr>
-        <w:spacing w:after="0" w:line="240" w:lineRule="auto"/>
+        <w:spacing w:after="0" w:line="40" w:lineRule="exact" w:before="0"/>
         <w:contextualSpacing/>
         <w:rPr>
           <w:b/>
@@ -857,7 +897,7 @@
     </w:p>
     <w:p>
       <w:pPr>
-        <w:spacing w:after="0" w:line="240" w:lineRule="auto"/>
+        <w:spacing w:after="0" w:line="40" w:lineRule="exact" w:before="0"/>
         <w:contextualSpacing/>
         <w:rPr>
           <w:b/>
@@ -946,7 +986,7 @@
     </w:p>
     <w:p>
       <w:pPr>
-        <w:spacing w:after="0" w:line="240" w:lineRule="auto"/>
+        <w:spacing w:after="0" w:line="40" w:lineRule="exact" w:before="0"/>
         <w:contextualSpacing/>
         <w:rPr>
           <w:b/>
@@ -1035,31 +1075,31 @@
     </w:p>
     <w:p>
       <w:pPr>
-        <w:spacing w:after="0" w:line="240" w:lineRule="auto"/>
-        <w:contextualSpacing/>
-        <w:rPr>
-          <w:b/>
-          <w:bCs/>
-          <w:sz w:val="20"/>
-          <w:szCs w:val="20"/>
-        </w:rPr>
-      </w:pPr>
-    </w:p>
-    <w:p>
-      <w:pPr>
-        <w:spacing w:after="0" w:line="240" w:lineRule="auto"/>
-        <w:contextualSpacing/>
-        <w:rPr>
-          <w:b/>
-          <w:bCs/>
-          <w:sz w:val="20"/>
-          <w:szCs w:val="20"/>
-        </w:rPr>
-      </w:pPr>
-    </w:p>
-    <w:p>
-      <w:pPr>
-        <w:spacing w:after="0" w:line="240" w:lineRule="auto"/>
+        <w:spacing w:after="0" w:line="40" w:lineRule="exact" w:before="0"/>
+        <w:contextualSpacing/>
+        <w:rPr>
+          <w:b/>
+          <w:bCs/>
+          <w:sz w:val="20"/>
+          <w:szCs w:val="20"/>
+        </w:rPr>
+      </w:pPr>
+    </w:p>
+    <w:p>
+      <w:pPr>
+        <w:spacing w:after="0" w:line="40" w:lineRule="exact" w:before="0"/>
+        <w:contextualSpacing/>
+        <w:rPr>
+          <w:b/>
+          <w:bCs/>
+          <w:sz w:val="20"/>
+          <w:szCs w:val="20"/>
+        </w:rPr>
+      </w:pPr>
+    </w:p>
+    <w:p>
+      <w:pPr>
+        <w:spacing w:after="0" w:line="40" w:lineRule="exact" w:before="0"/>
         <w:contextualSpacing/>
         <w:rPr>
           <w:sz w:val="20"/>
@@ -1225,7 +1265,7 @@
     </w:p>
     <w:p>
       <w:pPr>
-        <w:spacing w:after="0" w:line="240" w:lineRule="auto"/>
+        <w:spacing w:after="0" w:line="40" w:lineRule="exact" w:before="0"/>
         <w:contextualSpacing/>
         <w:rPr>
           <w:sz w:val="20"/>
@@ -1409,7 +1449,7 @@
     <w:p>
       <w:pPr>
         <w:pStyle w:val="ListParagraph"/>
-        <w:spacing w:after="0" w:line="240" w:lineRule="auto"/>
+        <w:spacing w:after="0" w:line="40" w:lineRule="exact" w:before="0"/>
         <w:rPr>
           <w:sz w:val="20"/>
           <w:szCs w:val="20"/>
@@ -1600,7 +1640,7 @@
     </w:p>
     <w:p>
       <w:pPr>
-        <w:spacing w:after="0" w:line="240" w:lineRule="auto"/>
+        <w:spacing w:after="0" w:line="40" w:lineRule="exact" w:before="0"/>
         <w:contextualSpacing/>
       </w:pPr>
     </w:p>
@@ -1803,7 +1843,7 @@
     </w:p>
     <w:p>
       <w:pPr>
-        <w:spacing w:after="0" w:line="240" w:lineRule="auto"/>
+        <w:spacing w:after="0" w:line="40" w:lineRule="exact" w:before="0"/>
         <w:contextualSpacing/>
         <w:rPr>
           <w:b/>
@@ -1982,7 +2022,7 @@
     </w:p>
     <w:p>
       <w:pPr>
-        <w:spacing w:after="0" w:line="240" w:lineRule="auto"/>
+        <w:spacing w:after="0" w:line="40" w:lineRule="exact" w:before="0"/>
         <w:contextualSpacing/>
         <w:rPr>
           <w:b/>

</xml_diff>